<commit_message>
fix(contracts): 장기형 결정 10–17 반영
- 11 채널 이전대가 = 해당 채널 미회수 재투자금 + 최근 12개월 순수익
- 13 미집행 재투자금 이월, 종료 시 50% 선수 지급 (제15조⑦ 신설)
- 14 재투자 '급여 수령 중' 조건 삭제
- 16 대표자 업무 중단 시 선수 무위약 해지 (제21조③7)
- 17 수수료·비용 결정은 서명 문서로만
- 10·12·15 현행 유지, 07-A·08-A·09-A 반영, 분리본·통합본 A
</commit_message>
<xml_diff>
--- a/archive/2026-10-02/contracts/01_장기_육상선수_전속_매니지먼트_계약서.docx
+++ b/archive/2026-10-02/contracts/01_장기_육상선수_전속_매니지먼트_계약서.docx
@@ -922,6 +922,21 @@
         </w:rPr>
         <w:t>에는 종이문서, 전자서명 문서, 이메일, 문자메시지 및 당사자를 확인할 수 있는 메신저 대화를 포함한다.</w:t>
       </w:r>
+      <w:r>
+        <w:rPr>
+          <w:rFonts w:ascii="Calibri" w:hAnsi="Calibri" w:eastAsia="Malgun Gothic"/>
+          <w:b w:val="0"/>
+        </w:rPr>
+        <w:t xml:space="preserve"> </w:t>
+      </w:r>
+      <w:r>
+        <w:rPr>
+          <w:rFonts w:ascii="Calibri" w:hAnsi="Calibri" w:eastAsia="Malgun Gothic"/>
+          <w:b/>
+          <w:color w:val="0D5F5A"/>
+        </w:rPr>
+        <w:t>다만 수수료·배분비율·서비스 비용의 결정과 변경은 당사자가 서명(전자서명 포함)한 문서로만 한다.</w:t>
+      </w:r>
     </w:p>
     <w:p>
       <w:pPr>
@@ -1357,7 +1372,7 @@
           <w:rFonts w:ascii="Calibri" w:hAnsi="Calibri" w:eastAsia="Malgun Gothic"/>
           <w:b w:val="0"/>
         </w:rPr>
-        <w:t>⑤ 제4항의 업무에 대한 비용은 별도의 위임계약 또는 서비스 신청서로 정한다. 이메일·문자·메신저로 업무 범위와 비용에 합의한 경우에도 유효한 서면합의로 본다.</w:t>
+        <w:t>⑤ 제4항의 업무에 대한 비용은 당사자가 서명(전자서명 포함)한 별도의 위임계약 또는 서비스 신청서로 정한다. 업무 일정 등 비용 외 사항은 이메일·문자·메신저로 협의할 수 있다.</w:t>
       </w:r>
     </w:p>
     <w:p>
@@ -3287,7 +3302,22 @@
           <w:rFonts w:ascii="Calibri" w:hAnsi="Calibri" w:eastAsia="Malgun Gothic"/>
           <w:b w:val="0"/>
         </w:rPr>
-        <w:t>② 선수가 소속기관으로부터 정상적으로 급여를 받는 동안, 회사는 회사의 기본 배분금 중 80%를 선수의 마케팅·브랜딩·콘텐츠 제작·홍보 등에 재투자하고 20%는 운영 유보금으로 보유한다.</w:t>
+        <w:t xml:space="preserve">② 회사는 </w:t>
+      </w:r>
+      <w:r>
+        <w:rPr>
+          <w:rFonts w:ascii="Calibri" w:hAnsi="Calibri" w:eastAsia="Malgun Gothic"/>
+          <w:b/>
+          <w:color w:val="0D5F5A"/>
+        </w:rPr>
+        <w:t>회사의 기본 배분금 중 80%를</w:t>
+      </w:r>
+      <w:r>
+        <w:rPr>
+          <w:rFonts w:ascii="Calibri" w:hAnsi="Calibri" w:eastAsia="Malgun Gothic"/>
+          <w:b w:val="0"/>
+        </w:rPr>
+        <w:t xml:space="preserve"> 선수의 마케팅·브랜딩·콘텐츠 제작·홍보 등에 재투자하고 20%는 운영 유보금으로 보유한다.</w:t>
       </w:r>
     </w:p>
     <w:p>
@@ -3452,16 +3482,33 @@
           <w:rFonts w:ascii="Calibri" w:hAnsi="Calibri" w:eastAsia="Malgun Gothic"/>
           <w:b w:val="0"/>
         </w:rPr>
-        <w:t>⑦ 회사는 재투자 내역과 증빙자료를 보관하고 정산명세서 또는 별도 투자보고서로 선수에게 제공한다.</w:t>
-      </w:r>
-    </w:p>
-    <w:p>
-      <w:r>
-        <w:rPr>
-          <w:rFonts w:ascii="Calibri" w:hAnsi="Calibri" w:eastAsia="Malgun Gothic"/>
-          <w:b w:val="0"/>
-        </w:rPr>
-        <w:t>⑧ AAC 개인채널 콘텐츠 참여보상은 선수의 자발적 참여에 대한 비회수성 홍보 인센티브이다. 선수 수익, 회사의 기본 배분금 또는 미회수 재투자금에서 공제하지 않으며 재투자금 원장에 계상하지 않는다.</w:t>
+        <w:t xml:space="preserve">⑦ </w:t>
+      </w:r>
+      <w:r>
+        <w:rPr>
+          <w:rFonts w:ascii="Calibri" w:hAnsi="Calibri" w:eastAsia="Malgun Gothic"/>
+          <w:b/>
+          <w:color w:val="0D5F5A"/>
+        </w:rPr>
+        <w:t>해당 회계연도에 집행되지 않은 재투자 예정액은 다음 회계연도로 이월하며, 계약이 종료될 때 집행되지 않고 남은 재투자 예정액의 50%는 종료일부터 45일 이내에 선수에게 지급한다.</w:t>
+      </w:r>
+    </w:p>
+    <w:p>
+      <w:r>
+        <w:rPr>
+          <w:rFonts w:ascii="Calibri" w:hAnsi="Calibri" w:eastAsia="Malgun Gothic"/>
+          <w:b w:val="0"/>
+        </w:rPr>
+        <w:t>⑧ 회사는 재투자 내역과 증빙자료를 보관하고 정산명세서 또는 별도 투자보고서로 선수에게 제공한다.</w:t>
+      </w:r>
+    </w:p>
+    <w:p>
+      <w:r>
+        <w:rPr>
+          <w:rFonts w:ascii="Calibri" w:hAnsi="Calibri" w:eastAsia="Malgun Gothic"/>
+          <w:b w:val="0"/>
+        </w:rPr>
+        <w:t>⑨ AAC 개인채널 콘텐츠 참여보상은 선수의 자발적 참여에 대한 비회수성 홍보 인센티브이다. 선수 수익, 회사의 기본 배분금 또는 미회수 재투자금에서 공제하지 않으며 재투자금 원장에 계상하지 않는다.</w:t>
       </w:r>
     </w:p>
     <w:p>
@@ -3683,46 +3730,31 @@
           <w:rFonts w:ascii="Calibri" w:hAnsi="Calibri" w:eastAsia="Malgun Gothic"/>
           <w:b w:val="0"/>
         </w:rPr>
-        <w:t>② 채널 이전대가는 다음 금액 중 큰 금액으로 한다.</w:t>
-      </w:r>
-    </w:p>
-    <w:p>
-      <w:pPr>
-        <w:numPr>
-          <w:ilvl w:val="0"/>
-          <w:numId w:val="32"/>
-        </w:numPr>
-      </w:pPr>
-      <w:r>
-        <w:rPr>
-          <w:rFonts w:ascii="Calibri" w:hAnsi="Calibri" w:eastAsia="Malgun Gothic"/>
-          <w:b w:val="0"/>
-        </w:rPr>
-        <w:t>누적 재투자금의 30%에 1,000만 원 초과분의 20%를 더한 금액</w:t>
-      </w:r>
-    </w:p>
-    <w:p>
-      <w:pPr>
-        <w:numPr>
-          <w:ilvl w:val="0"/>
-          <w:numId w:val="32"/>
-        </w:numPr>
-      </w:pPr>
-      <w:r>
-        <w:rPr>
-          <w:rFonts w:ascii="Calibri" w:hAnsi="Calibri" w:eastAsia="Malgun Gothic"/>
-          <w:b w:val="0"/>
-        </w:rPr>
-        <w:t>이전 요청일 직전 24개월 동안의 월평균 채널 순수익에 24를 곱한 금액</w:t>
-      </w:r>
-    </w:p>
-    <w:p>
-      <w:r>
-        <w:rPr>
-          <w:rFonts w:ascii="Calibri" w:hAnsi="Calibri" w:eastAsia="Malgun Gothic"/>
-          <w:b w:val="0"/>
-        </w:rPr>
-        <w:t>③ 채널 운영기간이 24개월 미만인 경우 실제 운영기간의 월평균 순수익에 24를 곱한다. 다만 실제 운영기간이 3개월 미만이면 제2항 제1호를 우선 적용하거나 별도 합의한다.</w:t>
+        <w:t xml:space="preserve">② 채널 이전대가는 </w:t>
+      </w:r>
+      <w:r>
+        <w:rPr>
+          <w:rFonts w:ascii="Calibri" w:hAnsi="Calibri" w:eastAsia="Malgun Gothic"/>
+          <w:b/>
+          <w:color w:val="0D5F5A"/>
+        </w:rPr>
+        <w:t>이전 요청일 현재 해당 채널에 집행된 재투자금 중 미회수 금액과 이전 요청일 직전 12개월 동안의 채널 순수익을 더한 금액</w:t>
+      </w:r>
+      <w:r>
+        <w:rPr>
+          <w:rFonts w:ascii="Calibri" w:hAnsi="Calibri" w:eastAsia="Malgun Gothic"/>
+          <w:b w:val="0"/>
+        </w:rPr>
+        <w:t>으로 한다.</w:t>
+      </w:r>
+    </w:p>
+    <w:p>
+      <w:r>
+        <w:rPr>
+          <w:rFonts w:ascii="Calibri" w:hAnsi="Calibri" w:eastAsia="Malgun Gothic"/>
+          <w:b w:val="0"/>
+        </w:rPr>
+        <w:t>③ 채널 운영기간이 12개월 미만인 경우 실제 운영기간의 채널 순수익을 더한다.</w:t>
       </w:r>
     </w:p>
     <w:p>
@@ -4234,6 +4266,22 @@
       </w:r>
     </w:p>
     <w:p>
+      <w:pPr>
+        <w:numPr>
+          <w:ilvl w:val="0"/>
+          <w:numId w:val="34"/>
+        </w:numPr>
+      </w:pPr>
+      <w:r>
+        <w:rPr>
+          <w:rFonts w:ascii="Calibri" w:hAnsi="Calibri" w:eastAsia="Malgun Gothic"/>
+          <w:b/>
+          <w:color w:val="0D5F5A"/>
+        </w:rPr>
+        <w:t>대표자 장호준이 회사 업무에서 물러나거나 3개월 이상 본 계약상 업무를 수행할 수 없게 된 경우</w:t>
+      </w:r>
+    </w:p>
+    <w:p>
       <w:r>
         <w:rPr>
           <w:rFonts w:ascii="Calibri" w:hAnsi="Calibri" w:eastAsia="Malgun Gothic"/>
@@ -4338,7 +4386,22 @@
           <w:rFonts w:ascii="Calibri" w:hAnsi="Calibri" w:eastAsia="Malgun Gothic"/>
           <w:b w:val="0"/>
         </w:rPr>
-        <w:t>⑤ 회사의 귀책으로 선수가 해지하는 경우 선수는 손해배상 예정액·미회수 재투자금·미경과 계약금을 반환하지 않는다.</w:t>
+        <w:t xml:space="preserve">⑤ 회사의 귀책 또는 </w:t>
+      </w:r>
+      <w:r>
+        <w:rPr>
+          <w:rFonts w:ascii="Calibri" w:hAnsi="Calibri" w:eastAsia="Malgun Gothic"/>
+          <w:b/>
+          <w:color w:val="0D5F5A"/>
+        </w:rPr>
+        <w:t>제3항제7호의 사유로</w:t>
+      </w:r>
+      <w:r>
+        <w:rPr>
+          <w:rFonts w:ascii="Calibri" w:hAnsi="Calibri" w:eastAsia="Malgun Gothic"/>
+          <w:b w:val="0"/>
+        </w:rPr>
+        <w:t xml:space="preserve"> 선수가 해지하는 경우 선수는 손해배상 예정액·미회수 재투자금·미경과 계약금을 반환하지 않는다.</w:t>
       </w:r>
     </w:p>
     <w:p>

</xml_diff>